<commit_message>
updated unemployment rate calculation for gap between state and region
</commit_message>
<xml_diff>
--- a/output/releases/2026-06_compass_lens.docx
+++ b/output/releases/2026-06_compass_lens.docx
@@ -326,7 +326,7 @@
         <w:t xml:space="preserve"> </w:t>
       </w:r>
       <w:r>
-        <w:t xml:space="preserve">The unemployment rate for the counties of the OWL Corridor moves in unision with the regional rate, suggesting that the corridor is a cohesive labor market unit. The corridor’s unemployment rate is currently at</w:t>
+        <w:t xml:space="preserve">The unemployment rate for the counties of the OWL Corridor moves in unison with the regional rate, suggesting that the corridor is a cohesive labor market unit. The corridor’s unemployment rate is currently at</w:t>
       </w:r>
       <w:r>
         <w:t xml:space="preserve"> </w:t>
@@ -336,7 +336,7 @@
           <w:b/>
           <w:bCs/>
         </w:rPr>
-        <w:t xml:space="preserve">%</w:t>
+        <w:t xml:space="preserve">4.5%</w:t>
       </w:r>
       <w:r>
         <w:t xml:space="preserve">, which is</w:t>

</xml_diff>

<commit_message>
Successfully added statewide trends to the plots and dynamic text.
</commit_message>
<xml_diff>
--- a/output/releases/2026-06_compass_lens.docx
+++ b/output/releases/2026-06_compass_lens.docx
@@ -349,7 +349,7 @@
           <w:b/>
           <w:bCs/>
         </w:rPr>
-        <w:t xml:space="preserve">%</w:t>
+        <w:t xml:space="preserve">0.6%</w:t>
       </w:r>
       <w:r>
         <w:t xml:space="preserve"> </w:t>
@@ -365,7 +365,7 @@
           <w:b/>
           <w:bCs/>
         </w:rPr>
-        <w:t xml:space="preserve">%</w:t>
+        <w:t xml:space="preserve">5.1%</w:t>
       </w:r>
       <w:r>
         <w:t xml:space="preserve">.</w:t>
@@ -592,7 +592,7 @@
           <w:i/>
           <w:iCs/>
         </w:rPr>
-        <w:t xml:space="preserve">Metrics reflect official LAUS/BLS benchmarks as of August 04, 2026. Historical series incorporate all revised estimates released through June 2026. In October 2025, a lapse in federal funding prohibited the collection of LAUS data. There is no LAUS data for October 2025.</w:t>
+        <w:t xml:space="preserve">Metrics reflect official LAUS/BLS benchmarks as of August 07, 2026. Historical series incorporate all revised estimates released through June 2026. In October 2025, a lapse in federal funding prohibited the collection of LAUS data. There is no LAUS data for October 2025.</w:t>
       </w:r>
     </w:p>
     <w:p>

</xml_diff>

<commit_message>
update text for report.
</commit_message>
<xml_diff>
--- a/output/releases/2026-06_compass_lens.docx
+++ b/output/releases/2026-06_compass_lens.docx
@@ -187,7 +187,23 @@
         <w:t xml:space="preserve"> </w:t>
       </w:r>
       <w:r>
-        <w:t xml:space="preserve">represents Livingston County. While individual county trends appear muted relative to the primary corridor baseline, their alignment underscores how tightly integrated these local economies are.</w:t>
+        <w:t xml:space="preserve">represents Livingston County. The state wide Michigan average is shown in</w:t>
+      </w:r>
+      <w:r>
+        <w:t xml:space="preserve"> </w:t>
+      </w:r>
+      <w:r>
+        <w:rPr>
+          <w:b/>
+          <w:bCs/>
+        </w:rPr>
+        <w:t xml:space="preserve">light gray</w:t>
+      </w:r>
+      <w:r>
+        <w:t xml:space="preserve"> </w:t>
+      </w:r>
+      <w:r>
+        <w:t xml:space="preserve">for comparison. While individual county trends appear muted relative to the primary corridor baseline, their alignment underscores how tightly integrated these local economies are.</w:t>
       </w:r>
     </w:p>
     <w:p>
@@ -368,7 +384,7 @@
         <w:t xml:space="preserve">5.1%</w:t>
       </w:r>
       <w:r>
-        <w:t xml:space="preserve">.</w:t>
+        <w:t xml:space="preserve">. The state wide unemployment rate generally trends above the OWL Corridor and its member counties, suggesting that the corridor has a more robust labor market than the state average.</w:t>
       </w:r>
     </w:p>
     <w:p>
@@ -523,7 +539,10 @@
         <w:t xml:space="preserve"> </w:t>
       </w:r>
       <w:r>
-        <w:t xml:space="preserve">The labor force for all three counties in the OWL Corridor has expanded since January 2022. Washtenaw County has experienced more pronounced swings in its labor force compared to the other counties of the corridor.</w:t>
+        <w:t xml:space="preserve">The labor force for all three counties in the OWL Corridor has expanded since January 2022. Washtenaw County has experienced more pronounced swings in its labor force compared to the other counties of the corridor. Oakland and Livingston counties appear to have lagged behind Washtenaw and the statewide trends through early 2025. Current analysis suggests these counties are returning to parity with Washtenaw and the state by maintaining their momentum as the labor force of Washtenaw and the state have cooled.</w:t>
+      </w:r>
+      <w:r>
+        <w:br/>
       </w:r>
     </w:p>
     <w:p>
@@ -545,7 +564,7 @@
         <w:t xml:space="preserve"> </w:t>
       </w:r>
       <w:r>
-        <w:t xml:space="preserve">A monthly analysis of the labor force would suggest that Washtenaw County is diverting from the corridor trend, with a decline relative to the other counties. The 12-month moving average index shows that Washtenaw is instead returning to parity with the corridor trend, suggesting that the county is returning to a more normalized labor market after a period of increased labor market involvement.</w:t>
+        <w:t xml:space="preserve">A monthly analysis of the labor force would suggest that Washtenaw County has moved in tadnum with the statewide trend but is diverging from the rest of the corridor. The 12-month moving average index shows that Washtenaw is instead returning to parity with the corridor trend, suggesting that the county is returning to a more normalized labor market after a period of increased labor market involvement. This could also be a reflection of the county’s larger demographic make up which may be entering a period of structural change.</w:t>
       </w:r>
     </w:p>
     <w:p>

</xml_diff>

<commit_message>
Final form before July Issue Publish
</commit_message>
<xml_diff>
--- a/output/releases/2026-06_compass_lens.docx
+++ b/output/releases/2026-06_compass_lens.docx
@@ -187,7 +187,7 @@
         <w:t xml:space="preserve"> </w:t>
       </w:r>
       <w:r>
-        <w:t xml:space="preserve">represents Livingston County. The state wide Michigan average is shown in</w:t>
+        <w:t xml:space="preserve">represents Livingston County. The statewide Michigan average is shown in</w:t>
       </w:r>
       <w:r>
         <w:t xml:space="preserve"> </w:t>
@@ -320,7 +320,7 @@
         <w:t xml:space="preserve"> </w:t>
       </w:r>
       <w:r>
-        <w:t xml:space="preserve">Typically, Livingston County exhibits the lowest unemployment rate, followed by Oakland and Washtenaw counties. The post-pandemic normalization of unemployment rates across the corridor is evident, with all three counties converging toward historical baselines. Recently the rates have increased slightly across the corridor, but remaining inline with the historical range since mid 2024.</w:t>
+        <w:t xml:space="preserve">Typically, Livingston County exhibits the lowest unemployment rate, followed by Oakland and Washtenaw counties. The post-pandemic normalization of unemployment rates across the corridor is evident, with all three counties converging toward historical baselines. Recently the rates have increased slightly across the corridor, while remaining in line with the historical range since mid 2024.</w:t>
       </w:r>
     </w:p>
     <w:p>
@@ -384,7 +384,7 @@
         <w:t xml:space="preserve">5.1%</w:t>
       </w:r>
       <w:r>
-        <w:t xml:space="preserve">. The state wide unemployment rate generally trends above the OWL Corridor and its member counties, suggesting that the corridor has a more robust labor market than the state average.</w:t>
+        <w:t xml:space="preserve">. The statewide unemployment rate generally trends above the OWL Corridor and its member counties, suggesting that the corridor has a more robust labor market than the state average.</w:t>
       </w:r>
     </w:p>
     <w:p>
@@ -539,7 +539,7 @@
         <w:t xml:space="preserve"> </w:t>
       </w:r>
       <w:r>
-        <w:t xml:space="preserve">The labor force for all three counties in the OWL Corridor has expanded since January 2022. Washtenaw County has experienced more pronounced swings in its labor force compared to the other counties of the corridor. Oakland and Livingston counties appear to have lagged behind Washtenaw and the statewide trends through early 2025. Current analysis suggests these counties are returning to parity with Washtenaw and the state by maintaining their momentum as the labor force of Washtenaw and the state have cooled.</w:t>
+        <w:t xml:space="preserve">The labor force for all three counties in the OWL Corridor has expanded since January 2022. Washtenaw County has experienced more pronounced swings in its labor force compared to the other counties of the corridor. Oakland and Livingston counties appear to have lagged behind Washtenaw and the statewide trends through early 2025. Current analysis suggests these counties are returning to parity with Washtenaw and the state by maintaining their momentum as the labor forces of Washtenaw and the state have cooled.</w:t>
       </w:r>
       <w:r>
         <w:br/>
@@ -564,7 +564,7 @@
         <w:t xml:space="preserve"> </w:t>
       </w:r>
       <w:r>
-        <w:t xml:space="preserve">A monthly analysis of the labor force would suggest that Washtenaw County has moved in tadnum with the statewide trend but is diverging from the rest of the corridor. The 12-month moving average index shows that Washtenaw is instead returning to parity with the corridor trend, suggesting that the county is returning to a more normalized labor market after a period of increased labor market involvement. This could also be a reflection of the county’s larger demographic make up which may be entering a period of structural change.</w:t>
+        <w:t xml:space="preserve">A monthly analysis of the labor force would suggest that Washtenaw County has moved in tandem with the statewide trend but is diverging from the rest of the corridor. The 12-month moving average index shows that Washtenaw is instead returning to parity with the corridor trend, suggesting that the county is returning to a more normalized labor market after a period of increased labor market involvement. This could also be a reflection of the county’s larger demographic makeup which may be entering a period of structural change.</w:t>
       </w:r>
     </w:p>
     <w:p>

</xml_diff>